<commit_message>
Add session notes and model file for each session
</commit_message>
<xml_diff>
--- a/Sessions Data/Session11-Notes.docx
+++ b/Sessions Data/Session11-Notes.docx
@@ -5724,13 +5724,7 @@
         <w:t>R</w:t>
       </w:r>
       <w:r>
-        <w:t xml:space="preserve">ight </w:t>
-      </w:r>
-      <w:r>
-        <w:t>now,</w:t>
-      </w:r>
-      <w:r>
-        <w:t xml:space="preserve"> I am mapping it on the state engineer’s mapping website on how many acres that would be </w:t>
+        <w:t xml:space="preserve">ight now, I am mapping it on the state engineer’s mapping website on how many acres that would be </w:t>
       </w:r>
       <w:proofErr w:type="gramStart"/>
       <w:r>
@@ -5757,22 +5751,7 @@
         <w:spacing w:before="240" w:line="276" w:lineRule="auto"/>
       </w:pPr>
       <w:r>
-        <w:t>Bank/AU3</w:t>
-      </w:r>
-      <w:r>
-        <w:t xml:space="preserve">: </w:t>
-      </w:r>
-      <w:r>
-        <w:t>S</w:t>
-      </w:r>
-      <w:r>
-        <w:t>o</w:t>
-      </w:r>
-      <w:r>
-        <w:t>,</w:t>
-      </w:r>
-      <w:r>
-        <w:t xml:space="preserve"> you are offering me an additional </w:t>
+        <w:t xml:space="preserve">Bank/AU3: So, you are offering me an additional </w:t>
       </w:r>
       <w:proofErr w:type="gramStart"/>
       <w:r>
@@ -5796,31 +5775,19 @@
         <w:t>WA2</w:t>
       </w:r>
       <w:r>
-        <w:t xml:space="preserve">: I’m looking at the </w:t>
-      </w:r>
-      <w:r>
-        <w:t>map</w:t>
+        <w:t>: I’m looking at the map</w:t>
       </w:r>
       <w:r>
         <w:t xml:space="preserve"> [at UT state engineer’s website]</w:t>
       </w:r>
       <w:r>
-        <w:t>,</w:t>
-      </w:r>
-      <w:r>
-        <w:t xml:space="preserve"> </w:t>
+        <w:t xml:space="preserve">, </w:t>
       </w:r>
       <w:r>
         <w:t xml:space="preserve">Maybe 25% is too much </w:t>
       </w:r>
       <w:r>
-        <w:t xml:space="preserve">but </w:t>
-      </w:r>
-      <w:r>
-        <w:t xml:space="preserve">there is </w:t>
-      </w:r>
-      <w:r>
-        <w:t>also a lot of this is ground water like big ground water pivots.</w:t>
+        <w:t>but there is also a lot of this is ground water like big ground water pivots.</w:t>
       </w:r>
       <w:r>
         <w:t xml:space="preserve"> </w:t>
@@ -5871,10 +5838,7 @@
         <w:t>$450-500?</w:t>
       </w:r>
       <w:r>
-        <w:t xml:space="preserve"> </w:t>
-      </w:r>
-      <w:r>
-        <w:t xml:space="preserve">I’m </w:t>
+        <w:t xml:space="preserve"> I’m </w:t>
       </w:r>
       <w:proofErr w:type="gramStart"/>
       <w:r>
@@ -6191,10 +6155,7 @@
         <w:t>.</w:t>
       </w:r>
       <w:r>
-        <w:t xml:space="preserve"> </w:t>
-      </w:r>
-      <w:r>
-        <w:t xml:space="preserve">They can still get a full crop if they pull on all that storage. Since they can’t store over years, they </w:t>
+        <w:t xml:space="preserve"> They can still get a full crop if they pull on all that storage. Since they can’t store over years, they </w:t>
       </w:r>
       <w:proofErr w:type="gramStart"/>
       <w:r>
@@ -6354,10 +6315,7 @@
         <w:spacing w:before="240" w:line="276" w:lineRule="auto"/>
       </w:pPr>
       <w:r>
-        <w:t>Bank/AU3</w:t>
-      </w:r>
-      <w:r>
-        <w:t>: I gave you 750 for additional</w:t>
+        <w:t>Bank/AU3: I gave you 750 for additional</w:t>
       </w:r>
     </w:p>
     <w:p>
@@ -6370,19 +6328,7 @@
         <w:spacing w:before="240" w:line="276" w:lineRule="auto"/>
       </w:pPr>
       <w:r>
-        <w:t>WA2</w:t>
-      </w:r>
-      <w:r>
-        <w:t xml:space="preserve">: </w:t>
-      </w:r>
-      <w:r>
-        <w:t>Yes,</w:t>
-      </w:r>
-      <w:r>
-        <w:t xml:space="preserve"> I will take that again</w:t>
-      </w:r>
-      <w:r>
-        <w:t>.</w:t>
+        <w:t>WA2: Yes, I will take that again.</w:t>
       </w:r>
     </w:p>
     <w:p>
@@ -6954,10 +6900,7 @@
         <w:spacing w:before="240" w:line="276" w:lineRule="auto"/>
       </w:pPr>
       <w:r>
-        <w:t>WA2</w:t>
-      </w:r>
-      <w:r>
-        <w:t>: Is there any reason not to?</w:t>
+        <w:t>WA2: Is there any reason not to?</w:t>
       </w:r>
     </w:p>
     <w:p>
@@ -6970,10 +6913,7 @@
         <w:spacing w:before="240" w:line="276" w:lineRule="auto"/>
       </w:pPr>
       <w:r>
-        <w:t>Bank/AU3</w:t>
-      </w:r>
-      <w:r>
-        <w:t xml:space="preserve">: Maybe if year 3 is dry and I </w:t>
+        <w:t xml:space="preserve">Bank/AU3: Maybe if year 3 is dry and I </w:t>
       </w:r>
       <w:proofErr w:type="gramStart"/>
       <w:r>
@@ -6981,10 +6921,7 @@
       </w:r>
       <w:proofErr w:type="gramEnd"/>
       <w:r>
-        <w:t xml:space="preserve"> water back to you? That’s not set </w:t>
-      </w:r>
-      <w:r>
-        <w:t>up.</w:t>
+        <w:t xml:space="preserve"> water back to you? That’s not set up.</w:t>
       </w:r>
     </w:p>
     <w:p>
@@ -7278,7 +7215,45 @@
         <w:t>it's</w:t>
       </w:r>
       <w:r>
-        <w:t xml:space="preserve"> interesting to think about. You price water like </w:t>
+        <w:t xml:space="preserve"> interesting to think about. </w:t>
+      </w:r>
+    </w:p>
+    <w:p>
+      <w:pPr>
+        <w:pStyle w:val="ListParagraph"/>
+        <w:numPr>
+          <w:ilvl w:val="0"/>
+          <w:numId w:val="28"/>
+        </w:numPr>
+        <w:spacing w:before="240" w:line="276" w:lineRule="auto"/>
+      </w:pPr>
+      <w:r>
+        <w:t>R: Wha</w:t>
+      </w:r>
+      <w:r>
+        <w:t xml:space="preserve">t impacts on </w:t>
+      </w:r>
+      <w:r>
+        <w:t xml:space="preserve">ag communities </w:t>
+      </w:r>
+      <w:r>
+        <w:t>and other parts of the market?</w:t>
+      </w:r>
+    </w:p>
+    <w:p>
+      <w:pPr>
+        <w:pStyle w:val="ListParagraph"/>
+        <w:numPr>
+          <w:ilvl w:val="0"/>
+          <w:numId w:val="28"/>
+        </w:numPr>
+        <w:spacing w:before="240" w:line="276" w:lineRule="auto"/>
+      </w:pPr>
+      <w:r>
+        <w:t xml:space="preserve">P13: </w:t>
+      </w:r>
+      <w:r>
+        <w:t xml:space="preserve">You price water like </w:t>
       </w:r>
       <w:r>
         <w:t>thi</w:t>
@@ -7287,7 +7262,21 @@
         <w:t>s and</w:t>
       </w:r>
       <w:r>
-        <w:t xml:space="preserve"> the owners of the water aren’t going to lease to ag producers bec</w:t>
+        <w:t xml:space="preserve"> the owners of the water aren’t going to lease to </w:t>
+      </w:r>
+      <w:proofErr w:type="gramStart"/>
+      <w:r>
+        <w:t>ag</w:t>
+      </w:r>
+      <w:proofErr w:type="gramEnd"/>
+      <w:r>
+        <w:t xml:space="preserve"> producers</w:t>
+      </w:r>
+      <w:r>
+        <w:t xml:space="preserve">, </w:t>
+      </w:r>
+      <w:r>
+        <w:t>bec</w:t>
       </w:r>
       <w:r>
         <w:t>au</w:t>
@@ -7304,29 +7293,43 @@
       <w:r>
         <w:t xml:space="preserve"> on </w:t>
       </w:r>
+      <w:r>
+        <w:t>what's</w:t>
+      </w:r>
+      <w:r>
+        <w:t xml:space="preserve"> being offered here</w:t>
+      </w:r>
+      <w:r>
+        <w:t xml:space="preserve">. </w:t>
+      </w:r>
+      <w:r>
+        <w:t>They</w:t>
+      </w:r>
+      <w:r>
+        <w:t xml:space="preserve"> </w:t>
+      </w:r>
+      <w:r>
+        <w:t xml:space="preserve">are not </w:t>
+      </w:r>
       <w:proofErr w:type="spellStart"/>
-      <w:proofErr w:type="gramStart"/>
-      <w:r>
-        <w:t>whats</w:t>
+      <w:r>
+        <w:t>gonna</w:t>
       </w:r>
       <w:proofErr w:type="spellEnd"/>
-      <w:proofErr w:type="gramEnd"/>
-      <w:r>
-        <w:t xml:space="preserve"> being offered here</w:t>
-      </w:r>
-      <w:r>
-        <w:t xml:space="preserve">. </w:t>
-      </w:r>
-      <w:proofErr w:type="gramStart"/>
-      <w:r>
-        <w:t>The</w:t>
-      </w:r>
-      <w:proofErr w:type="gramEnd"/>
-      <w:r>
-        <w:t xml:space="preserve"> you </w:t>
-      </w:r>
-      <w:r>
-        <w:t xml:space="preserve">are not </w:t>
+      <w:r>
+        <w:t xml:space="preserve"> produce that much. </w:t>
+      </w:r>
+      <w:r>
+        <w:t xml:space="preserve">The </w:t>
+      </w:r>
+      <w:r>
+        <w:t>effect</w:t>
+      </w:r>
+      <w:r>
+        <w:t xml:space="preserve"> through communities is going to be felt</w:t>
+      </w:r>
+      <w:r>
+        <w:t xml:space="preserve">, you are </w:t>
       </w:r>
       <w:proofErr w:type="spellStart"/>
       <w:r>
@@ -7334,29 +7337,10 @@
       </w:r>
       <w:proofErr w:type="spellEnd"/>
       <w:r>
-        <w:t xml:space="preserve"> produce that much. </w:t>
-      </w:r>
-      <w:r>
-        <w:t xml:space="preserve">The </w:t>
-      </w:r>
-      <w:proofErr w:type="gramStart"/>
-      <w:r>
-        <w:t>effects</w:t>
-      </w:r>
-      <w:proofErr w:type="gramEnd"/>
-      <w:r>
-        <w:t xml:space="preserve"> through communities </w:t>
-      </w:r>
-      <w:proofErr w:type="gramStart"/>
-      <w:r>
-        <w:t>is</w:t>
-      </w:r>
-      <w:proofErr w:type="gramEnd"/>
-      <w:r>
-        <w:t xml:space="preserve"> going to be felt</w:t>
-      </w:r>
-      <w:r>
-        <w:t xml:space="preserve">, you are </w:t>
+        <w:t xml:space="preserve"> lose more</w:t>
+      </w:r>
+      <w:r>
+        <w:t xml:space="preserve"> fields, </w:t>
       </w:r>
       <w:proofErr w:type="spellStart"/>
       <w:r>
@@ -7364,24 +7348,59 @@
       </w:r>
       <w:proofErr w:type="spellEnd"/>
       <w:r>
-        <w:t xml:space="preserve"> lose more</w:t>
-      </w:r>
-      <w:r>
-        <w:t xml:space="preserve"> fields, </w:t>
-      </w:r>
-      <w:proofErr w:type="spellStart"/>
-      <w:r>
-        <w:t>gonna</w:t>
-      </w:r>
-      <w:proofErr w:type="spellEnd"/>
-      <w:r>
         <w:t xml:space="preserve"> lose more to development</w:t>
       </w:r>
       <w:r>
-        <w:t xml:space="preserve">. These communities are changing already. </w:t>
-      </w:r>
-      <w:r>
-        <w:t>They</w:t>
+        <w:t>. These communities are changing already.</w:t>
+      </w:r>
+    </w:p>
+    <w:p>
+      <w:pPr>
+        <w:pStyle w:val="ListParagraph"/>
+        <w:numPr>
+          <w:ilvl w:val="0"/>
+          <w:numId w:val="28"/>
+        </w:numPr>
+        <w:spacing w:before="240" w:line="276" w:lineRule="auto"/>
+      </w:pPr>
+      <w:r>
+        <w:t>[</w:t>
+      </w:r>
+      <w:r>
+        <w:t>In GSL watershed enhancement trust</w:t>
+      </w:r>
+      <w:r>
+        <w:t>]</w:t>
+      </w:r>
+      <w:r>
+        <w:t>, the</w:t>
+      </w:r>
+      <w:r>
+        <w:t xml:space="preserve">y started with $40 million, not $300 million </w:t>
+      </w:r>
+      <w:r>
+        <w:t>her</w:t>
+      </w:r>
+      <w:r>
+        <w:t>e</w:t>
+      </w:r>
+      <w:r>
+        <w:t xml:space="preserve"> </w:t>
+      </w:r>
+      <w:r>
+        <w:t xml:space="preserve">– but that is still a big price tag in </w:t>
+      </w:r>
+      <w:r>
+        <w:t xml:space="preserve">people’s mind. </w:t>
+      </w:r>
+      <w:r>
+        <w:t xml:space="preserve"> </w:t>
+      </w:r>
+      <w:r>
+        <w:t>T</w:t>
+      </w:r>
+      <w:r>
+        <w:t>hey</w:t>
       </w:r>
       <w:r>
         <w:t xml:space="preserve">’ve tried to be </w:t>
@@ -7390,10 +7409,10 @@
         <w:t>cognizant</w:t>
       </w:r>
       <w:r>
-        <w:t xml:space="preserve"> [in GSL watershed trust]</w:t>
-      </w:r>
-      <w:r>
-        <w:t xml:space="preserve"> of not out compete </w:t>
+        <w:t xml:space="preserve"> </w:t>
+      </w:r>
+      <w:r>
+        <w:t xml:space="preserve">of not out compete </w:t>
       </w:r>
       <w:proofErr w:type="gramStart"/>
       <w:r>
@@ -7526,10 +7545,26 @@
         <w:t xml:space="preserve">in </w:t>
       </w:r>
       <w:r>
-        <w:t>UT. i</w:t>
-      </w:r>
-      <w:r>
-        <w:t xml:space="preserve">f that person can make that kind of money they </w:t>
+        <w:t xml:space="preserve">UT. </w:t>
+      </w:r>
+      <w:proofErr w:type="gramStart"/>
+      <w:r>
+        <w:t>i</w:t>
+      </w:r>
+      <w:r>
+        <w:t>f</w:t>
+      </w:r>
+      <w:proofErr w:type="gramEnd"/>
+      <w:r>
+        <w:t xml:space="preserve"> that person can make that kind of </w:t>
+      </w:r>
+      <w:proofErr w:type="gramStart"/>
+      <w:r>
+        <w:t>money</w:t>
+      </w:r>
+      <w:proofErr w:type="gramEnd"/>
+      <w:r>
+        <w:t xml:space="preserve"> they </w:t>
       </w:r>
       <w:r>
         <w:t>don't</w:t>
@@ -7559,10 +7594,7 @@
         <w:t xml:space="preserve"> not the owner of the land</w:t>
       </w:r>
       <w:r>
-        <w:t xml:space="preserve"> is not the operator. </w:t>
-      </w:r>
-      <w:r>
-        <w:t>That</w:t>
+        <w:t xml:space="preserve"> is not the operator. That</w:t>
       </w:r>
       <w:r>
         <w:t xml:space="preserve"> limits the scope </w:t>
@@ -7647,6 +7679,7 @@
         <w:spacing w:before="240" w:line="276" w:lineRule="auto"/>
       </w:pPr>
       <w:r>
+        <w:lastRenderedPageBreak/>
         <w:t>Fair m</w:t>
       </w:r>
       <w:r>
@@ -7683,11 +7716,7 @@
         <w:t xml:space="preserve">livestock somewhere else – It would have to </w:t>
       </w:r>
       <w:r>
-        <w:t xml:space="preserve">shipped in, which </w:t>
-      </w:r>
-      <w:r>
-        <w:lastRenderedPageBreak/>
-        <w:t xml:space="preserve">would probably cost more than what he can ever produce it for. </w:t>
+        <w:t xml:space="preserve">shipped in, which would probably cost more than what he can ever produce it for. </w:t>
       </w:r>
       <w:r>
         <w:t xml:space="preserve">It is not going to be all free money. It will cost the </w:t>
@@ -8464,12 +8493,19 @@
         <w:rPr>
           <w:rFonts w:ascii="Calibri" w:hAnsi="Calibri" w:cs="Calibri"/>
         </w:rPr>
-        <w:t>n inter Bear River Water Users Association</w:t>
+        <w:t xml:space="preserve">n inter Bear River Water Users </w:t>
       </w:r>
       <w:r>
         <w:rPr>
           <w:rFonts w:ascii="Calibri" w:hAnsi="Calibri" w:cs="Calibri"/>
         </w:rPr>
+        <w:lastRenderedPageBreak/>
+        <w:t>Association</w:t>
+      </w:r>
+      <w:r>
+        <w:rPr>
+          <w:rFonts w:ascii="Calibri" w:hAnsi="Calibri" w:cs="Calibri"/>
+        </w:rPr>
         <w:t xml:space="preserve"> bank </w:t>
       </w:r>
       <w:r>
@@ -8635,7 +8671,6 @@
         <w:rPr>
           <w:rFonts w:ascii="Calibri" w:hAnsi="Calibri" w:cs="Calibri"/>
         </w:rPr>
-        <w:lastRenderedPageBreak/>
         <w:t>don’t</w:t>
       </w:r>
       <w:proofErr w:type="gramEnd"/>
@@ -9057,13 +9092,7 @@
         <w:t xml:space="preserve"> easier</w:t>
       </w:r>
       <w:r>
-        <w:t xml:space="preserve"> – maybe </w:t>
-      </w:r>
-      <w:r>
-        <w:t>give them discounts on their rates</w:t>
-      </w:r>
-      <w:r>
-        <w:t>.</w:t>
+        <w:t xml:space="preserve"> – maybe give them discounts on their rates.</w:t>
       </w:r>
     </w:p>
     <w:p>
@@ -9473,6 +9502,32 @@
       <w:r>
         <w:t xml:space="preserve"> changes for your landscape.</w:t>
       </w:r>
+    </w:p>
+    <w:p>
+      <w:pPr>
+        <w:pBdr>
+          <w:bottom w:val="single" w:sz="12" w:space="1" w:color="auto"/>
+        </w:pBdr>
+        <w:spacing w:before="240" w:line="276" w:lineRule="auto"/>
+      </w:pPr>
+    </w:p>
+    <w:p>
+      <w:pPr>
+        <w:pStyle w:val="ListParagraph"/>
+        <w:spacing w:before="240" w:line="276" w:lineRule="auto"/>
+      </w:pPr>
+    </w:p>
+    <w:p>
+      <w:pPr>
+        <w:pStyle w:val="ListParagraph"/>
+        <w:spacing w:before="240" w:line="276" w:lineRule="auto"/>
+      </w:pPr>
+    </w:p>
+    <w:p>
+      <w:pPr>
+        <w:pStyle w:val="ListParagraph"/>
+        <w:spacing w:before="240" w:line="276" w:lineRule="auto"/>
+      </w:pPr>
     </w:p>
     <w:p>
       <w:pPr>

</xml_diff>